<commit_message>
Add orchestrator, diversity tool, orchestrated training, and new figures
</commit_message>
<xml_diff>
--- a/technical_report_movielens.docx
+++ b/technical_report_movielens.docx
@@ -437,9 +437,105 @@
     </w:p>
     <w:p>
       <w:pPr>
+        <w:spacing w:before="60" w:after="80"/>
+        <w:jc w:val="both"/>
+      </w:pPr>
+    </w:p>
+    <w:p>
+      <w:pPr>
+        <w:pStyle w:val="Heading2"/>
+        <w:rPr>
+          <w:rFonts w:ascii="Times New Roman" w:hAnsi="Times New Roman" w:cs="Times New Roman"/>
+        </w:rPr>
+      </w:pPr>
+      <w:r>
+        <w:rPr>
+          <w:rFonts w:ascii="Times New Roman" w:hAnsi="Times New Roman" w:cs="Times New Roman"/>
+        </w:rPr>
+        <w:t>1.4 System Architecture</w:t>
+      </w:r>
+    </w:p>
+    <w:p>
+      <w:pPr>
+        <w:spacing w:before="60" w:after="80"/>
+        <w:jc w:val="both"/>
+      </w:pPr>
+      <w:r>
+        <w:t xml:space="preserve">The figure below shows the end-to-end system architecture. Real MovieLens files are parsed by data_loader.py into interaction tuples. The </w:t>
+      </w:r>
+      <w:proofErr w:type="spellStart"/>
+      <w:r>
+        <w:t>LinUCB</w:t>
+      </w:r>
+      <w:proofErr w:type="spellEnd"/>
+      <w:r>
+        <w:t xml:space="preserve"> agent receives a 7-dimensional continuous context vector; the Q-Learning agent receives a discretized state index. Both agents select a genre arm, observe real user ratings as reward, and update their internal models via offline reject-sampling. Popularity and Random baselines serve as non-learning comparisons.</w:t>
+      </w:r>
+    </w:p>
+    <w:p>
+      <w:pPr>
+        <w:spacing w:before="60" w:after="80"/>
+        <w:jc w:val="both"/>
+      </w:pPr>
+    </w:p>
+    <w:p>
+      <w:pPr>
         <w:spacing w:after="160"/>
         <w:jc w:val="both"/>
       </w:pPr>
+      <w:r>
+        <w:rPr>
+          <w:noProof/>
+        </w:rPr>
+        <w:lastRenderedPageBreak/>
+        <w:drawing>
+          <wp:inline distT="0" distB="0" distL="0" distR="0" wp14:anchorId="338FBE14" wp14:editId="2C7BE387">
+            <wp:extent cx="5486400" cy="3931920"/>
+            <wp:effectExtent l="0" t="0" r="0" b="0"/>
+            <wp:docPr id="1001" name="arch" descr="System architecture diagram"/>
+            <wp:cNvGraphicFramePr/>
+            <a:graphic xmlns:a="http://schemas.openxmlformats.org/drawingml/2006/main">
+              <a:graphicData uri="http://schemas.openxmlformats.org/drawingml/2006/picture">
+                <pic:pic xmlns:pic="http://schemas.openxmlformats.org/drawingml/2006/picture">
+                  <pic:nvPicPr>
+                    <pic:cNvPr id="1001" name="arch"/>
+                    <pic:cNvPicPr/>
+                  </pic:nvPicPr>
+                  <pic:blipFill>
+                    <a:blip r:embed="rId8"/>
+                    <a:stretch>
+                      <a:fillRect/>
+                    </a:stretch>
+                  </pic:blipFill>
+                  <pic:spPr>
+                    <a:xfrm>
+                      <a:off x="0" y="0"/>
+                      <a:ext cx="5486400" cy="3931920"/>
+                    </a:xfrm>
+                    <a:prstGeom prst="rect">
+                      <a:avLst/>
+                    </a:prstGeom>
+                  </pic:spPr>
+                </pic:pic>
+              </a:graphicData>
+            </a:graphic>
+          </wp:inline>
+        </w:drawing>
+      </w:r>
+    </w:p>
+    <w:p>
+      <w:pPr>
+        <w:spacing w:before="40" w:after="200"/>
+        <w:jc w:val="center"/>
+      </w:pPr>
+      <w:r>
+        <w:rPr>
+          <w:i/>
+          <w:color w:val="777777"/>
+          <w:sz w:val="17"/>
+        </w:rPr>
+        <w:t>Figure 0. System architecture: real MovieLens data pipeline through RL agents to genre recommendation with real reward feedback loop.</w:t>
+      </w:r>
     </w:p>
     <w:p>
       <w:pPr>
@@ -540,7 +636,6 @@
                 <w:sz w:val="18"/>
                 <w:szCs w:val="18"/>
               </w:rPr>
-              <w:lastRenderedPageBreak/>
               <w:t>Property</w:t>
             </w:r>
           </w:p>
@@ -1069,6 +1164,7 @@
         <w:rPr>
           <w:rFonts w:ascii="Times New Roman" w:hAnsi="Times New Roman" w:cs="Times New Roman"/>
         </w:rPr>
+        <w:lastRenderedPageBreak/>
         <w:t>2.2 Files Used</w:t>
       </w:r>
     </w:p>
@@ -1795,7 +1891,6 @@
         <w:jc w:val="both"/>
       </w:pPr>
       <w:r>
-        <w:lastRenderedPageBreak/>
         <w:t>Note: 7,420 ratings were excluded because those movies did not belong to any of the 6 selected genre arms. Genres such as Documentary, Western, and Film-Noir were excluded due to insufficient coverage for bandit learning.</w:t>
       </w:r>
     </w:p>
@@ -1813,6 +1908,7 @@
         <w:rPr>
           <w:noProof/>
         </w:rPr>
+        <w:lastRenderedPageBreak/>
         <w:drawing>
           <wp:inline distT="0" distB="0" distL="0" distR="0" wp14:anchorId="42C49779" wp14:editId="0AF3D933">
             <wp:extent cx="5476875" cy="2428875"/>
@@ -1831,7 +1927,7 @@
                     </pic:cNvPicPr>
                   </pic:nvPicPr>
                   <pic:blipFill>
-                    <a:blip r:embed="rId8"/>
+                    <a:blip r:embed="rId9"/>
                     <a:srcRect/>
                     <a:stretch>
                       <a:fillRect/>
@@ -2613,6 +2709,7 @@
         <w:jc w:val="both"/>
       </w:pPr>
       <w:r>
+        <w:lastRenderedPageBreak/>
         <w:t>The exploration term quantifies uncertainty</w:t>
       </w:r>
       <w:r>
@@ -4493,7 +4590,6 @@
                 <w:sz w:val="18"/>
                 <w:szCs w:val="18"/>
               </w:rPr>
-              <w:lastRenderedPageBreak/>
               <w:t>senior_female</w:t>
             </w:r>
           </w:p>
@@ -4637,6 +4733,7 @@
         <w:jc w:val="both"/>
       </w:pPr>
       <w:r>
+        <w:lastRenderedPageBreak/>
         <w:t>In a live system, the agent recommends a genre and receives the user's real rating as reward. With historical logged data, we apply reject-sampling (Li et al., 2011):</w:t>
       </w:r>
     </w:p>
@@ -6125,7 +6222,6 @@
                 <w:sz w:val="18"/>
                 <w:szCs w:val="18"/>
               </w:rPr>
-              <w:lastRenderedPageBreak/>
               <w:t>Epsilon minimum</w:t>
             </w:r>
           </w:p>
@@ -6476,6 +6572,7 @@
                 <w:sz w:val="18"/>
                 <w:szCs w:val="18"/>
               </w:rPr>
+              <w:lastRenderedPageBreak/>
               <w:t>Rolling average window</w:t>
             </w:r>
           </w:p>
@@ -8007,7 +8104,7 @@
                     </pic:cNvPicPr>
                   </pic:nvPicPr>
                   <pic:blipFill>
-                    <a:blip r:embed="rId9"/>
+                    <a:blip r:embed="rId10"/>
                     <a:srcRect/>
                     <a:stretch>
                       <a:fillRect/>
@@ -8092,108 +8189,6 @@
             <wp:extent cx="5476875" cy="2381250"/>
             <wp:effectExtent l="0" t="0" r="0" b="0"/>
             <wp:docPr id="903771772" name="Picture 903771772"/>
-            <wp:cNvGraphicFramePr>
-              <a:graphicFrameLocks xmlns:a="http://schemas.openxmlformats.org/drawingml/2006/main" noChangeAspect="1"/>
-            </wp:cNvGraphicFramePr>
-            <a:graphic xmlns:a="http://schemas.openxmlformats.org/drawingml/2006/main">
-              <a:graphicData uri="http://schemas.openxmlformats.org/drawingml/2006/picture">
-                <pic:pic xmlns:pic="http://schemas.openxmlformats.org/drawingml/2006/picture">
-                  <pic:nvPicPr>
-                    <pic:cNvPr id="0" name=""/>
-                    <pic:cNvPicPr>
-                      <a:picLocks noChangeAspect="1" noChangeArrowheads="1"/>
-                    </pic:cNvPicPr>
-                  </pic:nvPicPr>
-                  <pic:blipFill>
-                    <a:blip r:embed="rId10"/>
-                    <a:srcRect/>
-                    <a:stretch>
-                      <a:fillRect/>
-                    </a:stretch>
-                  </pic:blipFill>
-                  <pic:spPr bwMode="auto">
-                    <a:xfrm>
-                      <a:off x="0" y="0"/>
-                      <a:ext cx="5476875" cy="2381250"/>
-                    </a:xfrm>
-                    <a:prstGeom prst="rect">
-                      <a:avLst/>
-                    </a:prstGeom>
-                  </pic:spPr>
-                </pic:pic>
-              </a:graphicData>
-            </a:graphic>
-          </wp:inline>
-        </w:drawing>
-      </w:r>
-    </w:p>
-    <w:p>
-      <w:pPr>
-        <w:spacing w:after="180"/>
-        <w:jc w:val="center"/>
-      </w:pPr>
-      <w:r>
-        <w:rPr>
-          <w:i/>
-          <w:iCs/>
-          <w:color w:val="444444"/>
-          <w:sz w:val="18"/>
-          <w:szCs w:val="18"/>
-        </w:rPr>
-        <w:t>Figure 3. Left: Genre match rate over 92,580 real interactions (rolling window = 500). Right: Cumulative reward on matched interactions. Both RL agents show positive learning trajectories from real rating feedback.</w:t>
-      </w:r>
-    </w:p>
-    <w:p>
-      <w:pPr>
-        <w:spacing w:after="80"/>
-      </w:pPr>
-    </w:p>
-    <w:p>
-      <w:pPr>
-        <w:spacing w:before="60" w:after="80"/>
-        <w:jc w:val="both"/>
-      </w:pPr>
-      <w:r>
-        <w:t xml:space="preserve">Both RL agents demonstrate positive learning trajectories across the 92,580 real interactions. Q-Learning's epsilon-decay schedule produces a visible shift from exploration to exploitation around interaction 60,000. </w:t>
-      </w:r>
-      <w:r>
-        <w:lastRenderedPageBreak/>
-        <w:t>LinUCB's UCB exploration term decays more gradually as the A matrices accumulate real rating evidence per genre. The Popularity baseline achieves a high match rate purely by exploiting Drama's 43% data share this is dataset exploitation, not learning.</w:t>
-      </w:r>
-    </w:p>
-    <w:p>
-      <w:pPr>
-        <w:spacing w:after="120"/>
-      </w:pPr>
-    </w:p>
-    <w:p>
-      <w:pPr>
-        <w:pStyle w:val="Heading2"/>
-        <w:rPr>
-          <w:rFonts w:ascii="Times New Roman" w:hAnsi="Times New Roman" w:cs="Times New Roman"/>
-        </w:rPr>
-      </w:pPr>
-      <w:r>
-        <w:rPr>
-          <w:rFonts w:ascii="Times New Roman" w:hAnsi="Times New Roman" w:cs="Times New Roman"/>
-        </w:rPr>
-        <w:t>5.4 LinUCB Learned Feature Weights</w:t>
-      </w:r>
-    </w:p>
-    <w:p>
-      <w:pPr>
-        <w:spacing w:before="120" w:after="60"/>
-        <w:jc w:val="center"/>
-      </w:pPr>
-      <w:r>
-        <w:rPr>
-          <w:noProof/>
-        </w:rPr>
-        <w:drawing>
-          <wp:inline distT="0" distB="0" distL="0" distR="0" wp14:anchorId="6A47FCDE" wp14:editId="66BCC71C">
-            <wp:extent cx="5429250" cy="2476500"/>
-            <wp:effectExtent l="0" t="0" r="0" b="0"/>
-            <wp:docPr id="1417253840" name="Picture 1417253840"/>
             <wp:cNvGraphicFramePr>
               <a:graphicFrameLocks xmlns:a="http://schemas.openxmlformats.org/drawingml/2006/main" noChangeAspect="1"/>
             </wp:cNvGraphicFramePr>
@@ -8216,6 +8211,108 @@
                   <pic:spPr bwMode="auto">
                     <a:xfrm>
                       <a:off x="0" y="0"/>
+                      <a:ext cx="5476875" cy="2381250"/>
+                    </a:xfrm>
+                    <a:prstGeom prst="rect">
+                      <a:avLst/>
+                    </a:prstGeom>
+                  </pic:spPr>
+                </pic:pic>
+              </a:graphicData>
+            </a:graphic>
+          </wp:inline>
+        </w:drawing>
+      </w:r>
+    </w:p>
+    <w:p>
+      <w:pPr>
+        <w:spacing w:after="180"/>
+        <w:jc w:val="center"/>
+      </w:pPr>
+      <w:r>
+        <w:rPr>
+          <w:i/>
+          <w:iCs/>
+          <w:color w:val="444444"/>
+          <w:sz w:val="18"/>
+          <w:szCs w:val="18"/>
+        </w:rPr>
+        <w:t>Figure 3. Left: Genre match rate over 92,580 real interactions (rolling window = 500). Right: Cumulative reward on matched interactions. Both RL agents show positive learning trajectories from real rating feedback.</w:t>
+      </w:r>
+    </w:p>
+    <w:p>
+      <w:pPr>
+        <w:spacing w:after="80"/>
+      </w:pPr>
+    </w:p>
+    <w:p>
+      <w:pPr>
+        <w:spacing w:before="60" w:after="80"/>
+        <w:jc w:val="both"/>
+      </w:pPr>
+      <w:r>
+        <w:t xml:space="preserve">Both RL agents demonstrate positive learning trajectories across the 92,580 real interactions. Q-Learning's epsilon-decay schedule produces a visible shift from exploration to exploitation around interaction 60,000. </w:t>
+      </w:r>
+      <w:r>
+        <w:lastRenderedPageBreak/>
+        <w:t>LinUCB's UCB exploration term decays more gradually as the A matrices accumulate real rating evidence per genre. The Popularity baseline achieves a high match rate purely by exploiting Drama's 43% data share this is dataset exploitation, not learning.</w:t>
+      </w:r>
+    </w:p>
+    <w:p>
+      <w:pPr>
+        <w:spacing w:after="120"/>
+      </w:pPr>
+    </w:p>
+    <w:p>
+      <w:pPr>
+        <w:pStyle w:val="Heading2"/>
+        <w:rPr>
+          <w:rFonts w:ascii="Times New Roman" w:hAnsi="Times New Roman" w:cs="Times New Roman"/>
+        </w:rPr>
+      </w:pPr>
+      <w:r>
+        <w:rPr>
+          <w:rFonts w:ascii="Times New Roman" w:hAnsi="Times New Roman" w:cs="Times New Roman"/>
+        </w:rPr>
+        <w:t>5.4 LinUCB Learned Feature Weights</w:t>
+      </w:r>
+    </w:p>
+    <w:p>
+      <w:pPr>
+        <w:spacing w:before="120" w:after="60"/>
+        <w:jc w:val="center"/>
+      </w:pPr>
+      <w:r>
+        <w:rPr>
+          <w:noProof/>
+        </w:rPr>
+        <w:drawing>
+          <wp:inline distT="0" distB="0" distL="0" distR="0" wp14:anchorId="6A47FCDE" wp14:editId="66BCC71C">
+            <wp:extent cx="5429250" cy="2476500"/>
+            <wp:effectExtent l="0" t="0" r="0" b="0"/>
+            <wp:docPr id="1417253840" name="Picture 1417253840"/>
+            <wp:cNvGraphicFramePr>
+              <a:graphicFrameLocks xmlns:a="http://schemas.openxmlformats.org/drawingml/2006/main" noChangeAspect="1"/>
+            </wp:cNvGraphicFramePr>
+            <a:graphic xmlns:a="http://schemas.openxmlformats.org/drawingml/2006/main">
+              <a:graphicData uri="http://schemas.openxmlformats.org/drawingml/2006/picture">
+                <pic:pic xmlns:pic="http://schemas.openxmlformats.org/drawingml/2006/picture">
+                  <pic:nvPicPr>
+                    <pic:cNvPr id="0" name=""/>
+                    <pic:cNvPicPr>
+                      <a:picLocks noChangeAspect="1" noChangeArrowheads="1"/>
+                    </pic:cNvPicPr>
+                  </pic:nvPicPr>
+                  <pic:blipFill>
+                    <a:blip r:embed="rId12"/>
+                    <a:srcRect/>
+                    <a:stretch>
+                      <a:fillRect/>
+                    </a:stretch>
+                  </pic:blipFill>
+                  <pic:spPr bwMode="auto">
+                    <a:xfrm>
+                      <a:off x="0" y="0"/>
                       <a:ext cx="5429250" cy="2476500"/>
                     </a:xfrm>
                     <a:prstGeom prst="rect">
@@ -8305,7 +8402,7 @@
                     </pic:cNvPicPr>
                   </pic:nvPicPr>
                   <pic:blipFill>
-                    <a:blip r:embed="rId12"/>
+                    <a:blip r:embed="rId13"/>
                     <a:srcRect/>
                     <a:stretch>
                       <a:fillRect/>
@@ -9255,7 +9352,7 @@
                     </pic:cNvPicPr>
                   </pic:nvPicPr>
                   <pic:blipFill>
-                    <a:blip r:embed="rId13"/>
+                    <a:blip r:embed="rId14"/>
                     <a:srcRect/>
                     <a:stretch>
                       <a:fillRect/>
@@ -9341,76 +9438,6 @@
             <wp:extent cx="5143500" cy="2266950"/>
             <wp:effectExtent l="0" t="0" r="0" b="0"/>
             <wp:docPr id="1392425032" name="Picture 1392425032"/>
-            <wp:cNvGraphicFramePr>
-              <a:graphicFrameLocks xmlns:a="http://schemas.openxmlformats.org/drawingml/2006/main" noChangeAspect="1"/>
-            </wp:cNvGraphicFramePr>
-            <a:graphic xmlns:a="http://schemas.openxmlformats.org/drawingml/2006/main">
-              <a:graphicData uri="http://schemas.openxmlformats.org/drawingml/2006/picture">
-                <pic:pic xmlns:pic="http://schemas.openxmlformats.org/drawingml/2006/picture">
-                  <pic:nvPicPr>
-                    <pic:cNvPr id="0" name=""/>
-                    <pic:cNvPicPr>
-                      <a:picLocks noChangeAspect="1" noChangeArrowheads="1"/>
-                    </pic:cNvPicPr>
-                  </pic:nvPicPr>
-                  <pic:blipFill>
-                    <a:blip r:embed="rId14"/>
-                    <a:srcRect/>
-                    <a:stretch>
-                      <a:fillRect/>
-                    </a:stretch>
-                  </pic:blipFill>
-                  <pic:spPr bwMode="auto">
-                    <a:xfrm>
-                      <a:off x="0" y="0"/>
-                      <a:ext cx="5143500" cy="2266950"/>
-                    </a:xfrm>
-                    <a:prstGeom prst="rect">
-                      <a:avLst/>
-                    </a:prstGeom>
-                  </pic:spPr>
-                </pic:pic>
-              </a:graphicData>
-            </a:graphic>
-          </wp:inline>
-        </w:drawing>
-      </w:r>
-    </w:p>
-    <w:p>
-      <w:pPr>
-        <w:spacing w:after="180"/>
-        <w:jc w:val="center"/>
-      </w:pPr>
-      <w:r>
-        <w:rPr>
-          <w:i/>
-          <w:iCs/>
-          <w:color w:val="444444"/>
-          <w:sz w:val="18"/>
-          <w:szCs w:val="18"/>
-        </w:rPr>
-        <w:t>Figure 7. Q-Learning epsilon decay over 92,580 real interactions. Reaches near-minimum (~0.05) by interaction 60,000, at which point the agent is predominantly exploiting its learned Q-table.</w:t>
-      </w:r>
-    </w:p>
-    <w:p>
-      <w:pPr>
-        <w:spacing w:after="80"/>
-      </w:pPr>
-    </w:p>
-    <w:p>
-      <w:pPr>
-        <w:spacing w:before="120" w:after="60"/>
-        <w:jc w:val="center"/>
-      </w:pPr>
-      <w:r>
-        <w:rPr>
-          <w:noProof/>
-        </w:rPr>
-        <w:drawing>
-          <wp:inline distT="0" distB="0" distL="0" distR="0" wp14:anchorId="4ED7ECDB" wp14:editId="4CA67615">
-            <wp:extent cx="5524500" cy="2457450"/>
-            <wp:effectExtent l="0" t="0" r="0" b="0"/>
-            <wp:docPr id="1701288904" name="Picture 1701288904"/>
             <wp:cNvGraphicFramePr>
               <a:graphicFrameLocks xmlns:a="http://schemas.openxmlformats.org/drawingml/2006/main" noChangeAspect="1"/>
             </wp:cNvGraphicFramePr>
@@ -9433,7 +9460,7 @@
                   <pic:spPr bwMode="auto">
                     <a:xfrm>
                       <a:off x="0" y="0"/>
-                      <a:ext cx="5524500" cy="2457450"/>
+                      <a:ext cx="5143500" cy="2266950"/>
                     </a:xfrm>
                     <a:prstGeom prst="rect">
                       <a:avLst/>
@@ -9459,7 +9486,7 @@
           <w:sz w:val="18"/>
           <w:szCs w:val="18"/>
         </w:rPr>
-        <w:t>Figure 8. Genre selection distribution over training for LinUCB (left) and Q-Learning (right). Both agents converge toward Drama dominance as real rating evidence confirms its high mean rating (3.69/5).</w:t>
+        <w:t>Figure 7. Q-Learning epsilon decay over 92,580 real interactions. Reaches near-minimum (~0.05) by interaction 60,000, at which point the agent is predominantly exploiting its learned Q-table.</w:t>
       </w:r>
     </w:p>
     <w:p>
@@ -9476,12 +9503,11 @@
         <w:rPr>
           <w:noProof/>
         </w:rPr>
-        <w:lastRenderedPageBreak/>
         <w:drawing>
-          <wp:inline distT="0" distB="0" distL="0" distR="0" wp14:anchorId="290CEC61" wp14:editId="6FD51C87">
-            <wp:extent cx="5048250" cy="2457450"/>
+          <wp:inline distT="0" distB="0" distL="0" distR="0" wp14:anchorId="4ED7ECDB" wp14:editId="4CA67615">
+            <wp:extent cx="5524500" cy="2457450"/>
             <wp:effectExtent l="0" t="0" r="0" b="0"/>
-            <wp:docPr id="331936655" name="Picture 331936655"/>
+            <wp:docPr id="1701288904" name="Picture 1701288904"/>
             <wp:cNvGraphicFramePr>
               <a:graphicFrameLocks xmlns:a="http://schemas.openxmlformats.org/drawingml/2006/main" noChangeAspect="1"/>
             </wp:cNvGraphicFramePr>
@@ -9504,6 +9530,77 @@
                   <pic:spPr bwMode="auto">
                     <a:xfrm>
                       <a:off x="0" y="0"/>
+                      <a:ext cx="5524500" cy="2457450"/>
+                    </a:xfrm>
+                    <a:prstGeom prst="rect">
+                      <a:avLst/>
+                    </a:prstGeom>
+                  </pic:spPr>
+                </pic:pic>
+              </a:graphicData>
+            </a:graphic>
+          </wp:inline>
+        </w:drawing>
+      </w:r>
+    </w:p>
+    <w:p>
+      <w:pPr>
+        <w:spacing w:after="180"/>
+        <w:jc w:val="center"/>
+      </w:pPr>
+      <w:r>
+        <w:rPr>
+          <w:i/>
+          <w:iCs/>
+          <w:color w:val="444444"/>
+          <w:sz w:val="18"/>
+          <w:szCs w:val="18"/>
+        </w:rPr>
+        <w:t>Figure 8. Genre selection distribution over training for LinUCB (left) and Q-Learning (right). Both agents converge toward Drama dominance as real rating evidence confirms its high mean rating (3.69/5).</w:t>
+      </w:r>
+    </w:p>
+    <w:p>
+      <w:pPr>
+        <w:spacing w:after="80"/>
+      </w:pPr>
+    </w:p>
+    <w:p>
+      <w:pPr>
+        <w:spacing w:before="120" w:after="60"/>
+        <w:jc w:val="center"/>
+      </w:pPr>
+      <w:r>
+        <w:rPr>
+          <w:noProof/>
+        </w:rPr>
+        <w:lastRenderedPageBreak/>
+        <w:drawing>
+          <wp:inline distT="0" distB="0" distL="0" distR="0" wp14:anchorId="290CEC61" wp14:editId="6FD51C87">
+            <wp:extent cx="5048250" cy="2457450"/>
+            <wp:effectExtent l="0" t="0" r="0" b="0"/>
+            <wp:docPr id="331936655" name="Picture 331936655"/>
+            <wp:cNvGraphicFramePr>
+              <a:graphicFrameLocks xmlns:a="http://schemas.openxmlformats.org/drawingml/2006/main" noChangeAspect="1"/>
+            </wp:cNvGraphicFramePr>
+            <a:graphic xmlns:a="http://schemas.openxmlformats.org/drawingml/2006/main">
+              <a:graphicData uri="http://schemas.openxmlformats.org/drawingml/2006/picture">
+                <pic:pic xmlns:pic="http://schemas.openxmlformats.org/drawingml/2006/picture">
+                  <pic:nvPicPr>
+                    <pic:cNvPr id="0" name=""/>
+                    <pic:cNvPicPr>
+                      <a:picLocks noChangeAspect="1" noChangeArrowheads="1"/>
+                    </pic:cNvPicPr>
+                  </pic:nvPicPr>
+                  <pic:blipFill>
+                    <a:blip r:embed="rId17"/>
+                    <a:srcRect/>
+                    <a:stretch>
+                      <a:fillRect/>
+                    </a:stretch>
+                  </pic:blipFill>
+                  <pic:spPr bwMode="auto">
+                    <a:xfrm>
+                      <a:off x="0" y="0"/>
                       <a:ext cx="5048250" cy="2457450"/>
                     </a:xfrm>
                     <a:prstGeom prst="rect">
@@ -9565,7 +9662,7 @@
                     </pic:cNvPicPr>
                   </pic:nvPicPr>
                   <pic:blipFill>
-                    <a:blip r:embed="rId17"/>
+                    <a:blip r:embed="rId18"/>
                     <a:srcRect/>
                     <a:stretch>
                       <a:fillRect/>
@@ -10712,8 +10809,8 @@
       </w:pPr>
     </w:p>
     <w:sectPr>
-      <w:headerReference w:type="default" r:id="rId18"/>
-      <w:footerReference w:type="default" r:id="rId19"/>
+      <w:headerReference w:type="default" r:id="rId19"/>
+      <w:footerReference w:type="default" r:id="rId20"/>
       <w:pgSz w:w="12240" w:h="15840"/>
       <w:pgMar w:top="1440" w:right="1260" w:bottom="1440" w:left="1440" w:header="708" w:footer="708" w:gutter="0"/>
       <w:cols w:space="720"/>

</xml_diff>